<commit_message>
Update project charter document
</commit_message>
<xml_diff>
--- a/documents/docx/Charter_Document_GroupG_EcosystemApp.docx
+++ b/documents/docx/Charter_Document_GroupG_EcosystemApp.docx
@@ -433,6 +433,230 @@
           <w:p>
             <w:pPr>
               <w:pStyle w:val="TableParagraph"/>
+              <w:numPr>
+                <w:ilvl w:val="0"/>
+                <w:numId w:val="9"/>
+              </w:numPr>
+              <w:tabs>
+                <w:tab w:val="left" w:pos="828"/>
+              </w:tabs>
+              <w:spacing w:before="1"/>
+              <w:rPr>
+                <w:rFonts w:ascii="Times New Roman" w:hAnsi="Times New Roman" w:cs="Times New Roman"/>
+                <w:sz w:val="24"/>
+                <w:szCs w:val="24"/>
+                <w:lang w:val="en-CA"/>
+              </w:rPr>
+            </w:pPr>
+            <w:r>
+              <w:rPr>
+                <w:rFonts w:ascii="Times New Roman" w:hAnsi="Times New Roman" w:cs="Times New Roman"/>
+                <w:sz w:val="24"/>
+                <w:szCs w:val="24"/>
+                <w:lang w:val="en-CA"/>
+              </w:rPr>
+              <w:t>Design a single freshwater ecosystem to serve as the setting for the application</w:t>
+            </w:r>
+          </w:p>
+          <w:p>
+            <w:pPr>
+              <w:pStyle w:val="TableParagraph"/>
+              <w:numPr>
+                <w:ilvl w:val="0"/>
+                <w:numId w:val="9"/>
+              </w:numPr>
+              <w:tabs>
+                <w:tab w:val="left" w:pos="828"/>
+              </w:tabs>
+              <w:spacing w:before="1"/>
+              <w:rPr>
+                <w:rFonts w:ascii="Times New Roman" w:hAnsi="Times New Roman" w:cs="Times New Roman"/>
+                <w:sz w:val="24"/>
+                <w:szCs w:val="24"/>
+                <w:lang w:val="en-CA"/>
+              </w:rPr>
+            </w:pPr>
+            <w:r>
+              <w:rPr>
+                <w:rFonts w:ascii="Times New Roman" w:hAnsi="Times New Roman" w:cs="Times New Roman"/>
+                <w:sz w:val="24"/>
+                <w:szCs w:val="24"/>
+                <w:lang w:val="en-CA"/>
+              </w:rPr>
+              <w:t>Create six to eight freshwater animal designs</w:t>
+            </w:r>
+          </w:p>
+          <w:p>
+            <w:pPr>
+              <w:pStyle w:val="TableParagraph"/>
+              <w:numPr>
+                <w:ilvl w:val="0"/>
+                <w:numId w:val="9"/>
+              </w:numPr>
+              <w:tabs>
+                <w:tab w:val="left" w:pos="828"/>
+              </w:tabs>
+              <w:spacing w:before="1"/>
+              <w:rPr>
+                <w:rFonts w:ascii="Times New Roman" w:hAnsi="Times New Roman" w:cs="Times New Roman"/>
+                <w:sz w:val="24"/>
+                <w:szCs w:val="24"/>
+                <w:lang w:val="en-CA"/>
+              </w:rPr>
+            </w:pPr>
+            <w:r>
+              <w:rPr>
+                <w:rFonts w:ascii="Times New Roman" w:hAnsi="Times New Roman" w:cs="Times New Roman"/>
+                <w:sz w:val="24"/>
+                <w:szCs w:val="24"/>
+                <w:lang w:val="en-CA"/>
+              </w:rPr>
+              <w:t>Research and present basic information about each animal, including habitat, diet, and the impact of human activities</w:t>
+            </w:r>
+          </w:p>
+          <w:p>
+            <w:pPr>
+              <w:pStyle w:val="TableParagraph"/>
+              <w:numPr>
+                <w:ilvl w:val="0"/>
+                <w:numId w:val="9"/>
+              </w:numPr>
+              <w:tabs>
+                <w:tab w:val="left" w:pos="828"/>
+              </w:tabs>
+              <w:spacing w:before="1"/>
+              <w:rPr>
+                <w:rFonts w:ascii="Times New Roman" w:hAnsi="Times New Roman" w:cs="Times New Roman"/>
+                <w:sz w:val="24"/>
+                <w:szCs w:val="24"/>
+                <w:lang w:val="en-CA"/>
+              </w:rPr>
+            </w:pPr>
+            <w:r>
+              <w:rPr>
+                <w:rFonts w:ascii="Times New Roman" w:hAnsi="Times New Roman" w:cs="Times New Roman"/>
+                <w:sz w:val="24"/>
+                <w:szCs w:val="24"/>
+                <w:lang w:val="en-CA"/>
+              </w:rPr>
+              <w:t>Allow users to discover animals through interactive gameplay</w:t>
+            </w:r>
+          </w:p>
+          <w:p>
+            <w:pPr>
+              <w:pStyle w:val="TableParagraph"/>
+              <w:numPr>
+                <w:ilvl w:val="0"/>
+                <w:numId w:val="9"/>
+              </w:numPr>
+              <w:tabs>
+                <w:tab w:val="left" w:pos="828"/>
+              </w:tabs>
+              <w:spacing w:before="1"/>
+              <w:rPr>
+                <w:rFonts w:ascii="Times New Roman" w:hAnsi="Times New Roman" w:cs="Times New Roman"/>
+                <w:sz w:val="24"/>
+                <w:szCs w:val="24"/>
+                <w:lang w:val="en-CA"/>
+              </w:rPr>
+            </w:pPr>
+            <w:r>
+              <w:rPr>
+                <w:rFonts w:ascii="Times New Roman" w:hAnsi="Times New Roman" w:cs="Times New Roman"/>
+                <w:sz w:val="24"/>
+                <w:szCs w:val="24"/>
+                <w:lang w:val="en-CA"/>
+              </w:rPr>
+              <w:t>Display collected animals in a visual “sticker book”</w:t>
+            </w:r>
+          </w:p>
+          <w:p>
+            <w:pPr>
+              <w:pStyle w:val="TableParagraph"/>
+              <w:numPr>
+                <w:ilvl w:val="0"/>
+                <w:numId w:val="9"/>
+              </w:numPr>
+              <w:tabs>
+                <w:tab w:val="left" w:pos="828"/>
+              </w:tabs>
+              <w:spacing w:before="1"/>
+              <w:rPr>
+                <w:rFonts w:ascii="Times New Roman" w:hAnsi="Times New Roman" w:cs="Times New Roman"/>
+                <w:sz w:val="24"/>
+                <w:szCs w:val="24"/>
+                <w:lang w:val="en-CA"/>
+              </w:rPr>
+            </w:pPr>
+            <w:r>
+              <w:rPr>
+                <w:rFonts w:ascii="Times New Roman" w:hAnsi="Times New Roman" w:cs="Times New Roman"/>
+                <w:sz w:val="24"/>
+                <w:szCs w:val="24"/>
+                <w:lang w:val="en-CA"/>
+              </w:rPr>
+              <w:t>Present age-appropriate educational facts written for a reading level of approximately nine years old</w:t>
+            </w:r>
+          </w:p>
+          <w:p>
+            <w:pPr>
+              <w:pStyle w:val="TableParagraph"/>
+              <w:numPr>
+                <w:ilvl w:val="0"/>
+                <w:numId w:val="9"/>
+              </w:numPr>
+              <w:tabs>
+                <w:tab w:val="left" w:pos="828"/>
+              </w:tabs>
+              <w:spacing w:before="1"/>
+              <w:rPr>
+                <w:rFonts w:ascii="Times New Roman" w:hAnsi="Times New Roman" w:cs="Times New Roman"/>
+                <w:sz w:val="24"/>
+                <w:szCs w:val="24"/>
+                <w:lang w:val="en-CA"/>
+              </w:rPr>
+            </w:pPr>
+            <w:r>
+              <w:rPr>
+                <w:rFonts w:ascii="Times New Roman" w:hAnsi="Times New Roman" w:cs="Times New Roman"/>
+                <w:sz w:val="24"/>
+                <w:szCs w:val="24"/>
+                <w:lang w:val="en-CA"/>
+              </w:rPr>
+              <w:t>Include one event that demonstrates a negative impact on animal populations</w:t>
+            </w:r>
+          </w:p>
+          <w:p>
+            <w:pPr>
+              <w:pStyle w:val="TableParagraph"/>
+              <w:numPr>
+                <w:ilvl w:val="0"/>
+                <w:numId w:val="9"/>
+              </w:numPr>
+              <w:tabs>
+                <w:tab w:val="left" w:pos="828"/>
+              </w:tabs>
+              <w:spacing w:before="1"/>
+              <w:rPr>
+                <w:rFonts w:ascii="Times New Roman" w:hAnsi="Times New Roman" w:cs="Times New Roman"/>
+                <w:sz w:val="24"/>
+                <w:szCs w:val="24"/>
+                <w:lang w:val="en-CA"/>
+              </w:rPr>
+            </w:pPr>
+            <w:r>
+              <w:rPr>
+                <w:rFonts w:ascii="Times New Roman" w:hAnsi="Times New Roman" w:cs="Times New Roman"/>
+                <w:sz w:val="24"/>
+                <w:szCs w:val="24"/>
+                <w:lang w:val="en-CA"/>
+              </w:rPr>
+              <w:t>Include one simple interaction that illustrates how positive human actions can help restore ecosystem health</w:t>
+            </w:r>
+          </w:p>
+          <w:p>
+            <w:pPr>
+              <w:pStyle w:val="TableParagraph"/>
               <w:tabs>
                 <w:tab w:val="left" w:pos="828"/>
               </w:tabs>
@@ -444,14 +668,6 @@
                 <w:szCs w:val="24"/>
               </w:rPr>
             </w:pPr>
-            <w:r>
-              <w:rPr>
-                <w:rFonts w:ascii="Times New Roman" w:hAnsi="Times New Roman" w:cs="Times New Roman"/>
-                <w:sz w:val="24"/>
-                <w:szCs w:val="24"/>
-              </w:rPr>
-              <w:t>The objectives of this project are to design a single freshwater ecosystem to serve as the setting for the application and to create six to eight freshwater animal designs. The project will include researching and presenting basic information about each animal, including habitat, diet, and the impact of human activities. The application will allow users to discover animals through interaction, display collected animals in a visual sticker book, and present age-appropriate educational facts written for a reading level of approximately nine years old. Additionally, the project will include one event that demonstrates a negative impact on animal populations and one simple interaction that illustrates how positive human actions can help restore ecosystem health.</w:t>
-            </w:r>
           </w:p>
         </w:tc>
       </w:tr>
@@ -1391,8 +1607,18 @@
                 <w:sz w:val="24"/>
                 <w:szCs w:val="24"/>
               </w:rPr>
-              <w:t>Aubin Chriss Izere</w:t>
-            </w:r>
+              <w:t xml:space="preserve">Aubin Chriss </w:t>
+            </w:r>
+            <w:proofErr w:type="spellStart"/>
+            <w:r>
+              <w:rPr>
+                <w:rFonts w:ascii="Times New Roman" w:hAnsi="Times New Roman" w:cs="Times New Roman"/>
+                <w:sz w:val="24"/>
+                <w:szCs w:val="24"/>
+              </w:rPr>
+              <w:t>Izere</w:t>
+            </w:r>
+            <w:proofErr w:type="spellEnd"/>
           </w:p>
           <w:p>
             <w:pPr>
@@ -4649,6 +4875,119 @@
     </w:lvl>
   </w:abstractNum>
   <w:abstractNum w:abstractNumId="2" w15:restartNumberingAfterBreak="0">
+    <w:nsid w:val="32220C0C"/>
+    <w:multiLevelType w:val="hybridMultilevel"/>
+    <w:tmpl w:val="9A30C82A"/>
+    <w:lvl w:ilvl="0" w:tplc="10090001">
+      <w:start w:val="1"/>
+      <w:numFmt w:val="bullet"/>
+      <w:lvlText w:val=""/>
+      <w:lvlJc w:val="left"/>
+      <w:pPr>
+        <w:ind w:left="1180" w:hanging="360"/>
+      </w:pPr>
+      <w:rPr>
+        <w:rFonts w:ascii="Symbol" w:hAnsi="Symbol" w:hint="default"/>
+      </w:rPr>
+    </w:lvl>
+    <w:lvl w:ilvl="1" w:tplc="10090003" w:tentative="1">
+      <w:start w:val="1"/>
+      <w:numFmt w:val="bullet"/>
+      <w:lvlText w:val="o"/>
+      <w:lvlJc w:val="left"/>
+      <w:pPr>
+        <w:ind w:left="1900" w:hanging="360"/>
+      </w:pPr>
+      <w:rPr>
+        <w:rFonts w:ascii="Courier New" w:hAnsi="Courier New" w:cs="Courier New" w:hint="default"/>
+      </w:rPr>
+    </w:lvl>
+    <w:lvl w:ilvl="2" w:tplc="10090005" w:tentative="1">
+      <w:start w:val="1"/>
+      <w:numFmt w:val="bullet"/>
+      <w:lvlText w:val=""/>
+      <w:lvlJc w:val="left"/>
+      <w:pPr>
+        <w:ind w:left="2620" w:hanging="360"/>
+      </w:pPr>
+      <w:rPr>
+        <w:rFonts w:ascii="Wingdings" w:hAnsi="Wingdings" w:hint="default"/>
+      </w:rPr>
+    </w:lvl>
+    <w:lvl w:ilvl="3" w:tplc="10090001" w:tentative="1">
+      <w:start w:val="1"/>
+      <w:numFmt w:val="bullet"/>
+      <w:lvlText w:val=""/>
+      <w:lvlJc w:val="left"/>
+      <w:pPr>
+        <w:ind w:left="3340" w:hanging="360"/>
+      </w:pPr>
+      <w:rPr>
+        <w:rFonts w:ascii="Symbol" w:hAnsi="Symbol" w:hint="default"/>
+      </w:rPr>
+    </w:lvl>
+    <w:lvl w:ilvl="4" w:tplc="10090003" w:tentative="1">
+      <w:start w:val="1"/>
+      <w:numFmt w:val="bullet"/>
+      <w:lvlText w:val="o"/>
+      <w:lvlJc w:val="left"/>
+      <w:pPr>
+        <w:ind w:left="4060" w:hanging="360"/>
+      </w:pPr>
+      <w:rPr>
+        <w:rFonts w:ascii="Courier New" w:hAnsi="Courier New" w:cs="Courier New" w:hint="default"/>
+      </w:rPr>
+    </w:lvl>
+    <w:lvl w:ilvl="5" w:tplc="10090005" w:tentative="1">
+      <w:start w:val="1"/>
+      <w:numFmt w:val="bullet"/>
+      <w:lvlText w:val=""/>
+      <w:lvlJc w:val="left"/>
+      <w:pPr>
+        <w:ind w:left="4780" w:hanging="360"/>
+      </w:pPr>
+      <w:rPr>
+        <w:rFonts w:ascii="Wingdings" w:hAnsi="Wingdings" w:hint="default"/>
+      </w:rPr>
+    </w:lvl>
+    <w:lvl w:ilvl="6" w:tplc="10090001" w:tentative="1">
+      <w:start w:val="1"/>
+      <w:numFmt w:val="bullet"/>
+      <w:lvlText w:val=""/>
+      <w:lvlJc w:val="left"/>
+      <w:pPr>
+        <w:ind w:left="5500" w:hanging="360"/>
+      </w:pPr>
+      <w:rPr>
+        <w:rFonts w:ascii="Symbol" w:hAnsi="Symbol" w:hint="default"/>
+      </w:rPr>
+    </w:lvl>
+    <w:lvl w:ilvl="7" w:tplc="10090003" w:tentative="1">
+      <w:start w:val="1"/>
+      <w:numFmt w:val="bullet"/>
+      <w:lvlText w:val="o"/>
+      <w:lvlJc w:val="left"/>
+      <w:pPr>
+        <w:ind w:left="6220" w:hanging="360"/>
+      </w:pPr>
+      <w:rPr>
+        <w:rFonts w:ascii="Courier New" w:hAnsi="Courier New" w:cs="Courier New" w:hint="default"/>
+      </w:rPr>
+    </w:lvl>
+    <w:lvl w:ilvl="8" w:tplc="10090005" w:tentative="1">
+      <w:start w:val="1"/>
+      <w:numFmt w:val="bullet"/>
+      <w:lvlText w:val=""/>
+      <w:lvlJc w:val="left"/>
+      <w:pPr>
+        <w:ind w:left="6940" w:hanging="360"/>
+      </w:pPr>
+      <w:rPr>
+        <w:rFonts w:ascii="Wingdings" w:hAnsi="Wingdings" w:hint="default"/>
+      </w:rPr>
+    </w:lvl>
+  </w:abstractNum>
+  <w:abstractNum w:abstractNumId="3" w15:restartNumberingAfterBreak="0">
     <w:nsid w:val="405001D2"/>
     <w:multiLevelType w:val="hybridMultilevel"/>
     <w:tmpl w:val="8ACE6C70"/>
@@ -4769,7 +5108,119 @@
       </w:rPr>
     </w:lvl>
   </w:abstractNum>
-  <w:abstractNum w:abstractNumId="3" w15:restartNumberingAfterBreak="0">
+  <w:abstractNum w:abstractNumId="4" w15:restartNumberingAfterBreak="0">
+    <w:nsid w:val="4FF77B03"/>
+    <w:multiLevelType w:val="hybridMultilevel"/>
+    <w:tmpl w:val="4EF8D532"/>
+    <w:lvl w:ilvl="0" w:tplc="D2FA57A2">
+      <w:numFmt w:val="bullet"/>
+      <w:lvlText w:val=""/>
+      <w:lvlJc w:val="left"/>
+      <w:pPr>
+        <w:ind w:left="820" w:hanging="360"/>
+      </w:pPr>
+      <w:rPr>
+        <w:rFonts w:ascii="Times New Roman" w:eastAsia="Arial" w:hAnsi="Times New Roman" w:cs="Times New Roman" w:hint="default"/>
+      </w:rPr>
+    </w:lvl>
+    <w:lvl w:ilvl="1" w:tplc="10090003" w:tentative="1">
+      <w:start w:val="1"/>
+      <w:numFmt w:val="bullet"/>
+      <w:lvlText w:val="o"/>
+      <w:lvlJc w:val="left"/>
+      <w:pPr>
+        <w:ind w:left="1540" w:hanging="360"/>
+      </w:pPr>
+      <w:rPr>
+        <w:rFonts w:ascii="Courier New" w:hAnsi="Courier New" w:cs="Courier New" w:hint="default"/>
+      </w:rPr>
+    </w:lvl>
+    <w:lvl w:ilvl="2" w:tplc="10090005" w:tentative="1">
+      <w:start w:val="1"/>
+      <w:numFmt w:val="bullet"/>
+      <w:lvlText w:val=""/>
+      <w:lvlJc w:val="left"/>
+      <w:pPr>
+        <w:ind w:left="2260" w:hanging="360"/>
+      </w:pPr>
+      <w:rPr>
+        <w:rFonts w:ascii="Wingdings" w:hAnsi="Wingdings" w:hint="default"/>
+      </w:rPr>
+    </w:lvl>
+    <w:lvl w:ilvl="3" w:tplc="10090001" w:tentative="1">
+      <w:start w:val="1"/>
+      <w:numFmt w:val="bullet"/>
+      <w:lvlText w:val=""/>
+      <w:lvlJc w:val="left"/>
+      <w:pPr>
+        <w:ind w:left="2980" w:hanging="360"/>
+      </w:pPr>
+      <w:rPr>
+        <w:rFonts w:ascii="Symbol" w:hAnsi="Symbol" w:hint="default"/>
+      </w:rPr>
+    </w:lvl>
+    <w:lvl w:ilvl="4" w:tplc="10090003" w:tentative="1">
+      <w:start w:val="1"/>
+      <w:numFmt w:val="bullet"/>
+      <w:lvlText w:val="o"/>
+      <w:lvlJc w:val="left"/>
+      <w:pPr>
+        <w:ind w:left="3700" w:hanging="360"/>
+      </w:pPr>
+      <w:rPr>
+        <w:rFonts w:ascii="Courier New" w:hAnsi="Courier New" w:cs="Courier New" w:hint="default"/>
+      </w:rPr>
+    </w:lvl>
+    <w:lvl w:ilvl="5" w:tplc="10090005" w:tentative="1">
+      <w:start w:val="1"/>
+      <w:numFmt w:val="bullet"/>
+      <w:lvlText w:val=""/>
+      <w:lvlJc w:val="left"/>
+      <w:pPr>
+        <w:ind w:left="4420" w:hanging="360"/>
+      </w:pPr>
+      <w:rPr>
+        <w:rFonts w:ascii="Wingdings" w:hAnsi="Wingdings" w:hint="default"/>
+      </w:rPr>
+    </w:lvl>
+    <w:lvl w:ilvl="6" w:tplc="10090001" w:tentative="1">
+      <w:start w:val="1"/>
+      <w:numFmt w:val="bullet"/>
+      <w:lvlText w:val=""/>
+      <w:lvlJc w:val="left"/>
+      <w:pPr>
+        <w:ind w:left="5140" w:hanging="360"/>
+      </w:pPr>
+      <w:rPr>
+        <w:rFonts w:ascii="Symbol" w:hAnsi="Symbol" w:hint="default"/>
+      </w:rPr>
+    </w:lvl>
+    <w:lvl w:ilvl="7" w:tplc="10090003" w:tentative="1">
+      <w:start w:val="1"/>
+      <w:numFmt w:val="bullet"/>
+      <w:lvlText w:val="o"/>
+      <w:lvlJc w:val="left"/>
+      <w:pPr>
+        <w:ind w:left="5860" w:hanging="360"/>
+      </w:pPr>
+      <w:rPr>
+        <w:rFonts w:ascii="Courier New" w:hAnsi="Courier New" w:cs="Courier New" w:hint="default"/>
+      </w:rPr>
+    </w:lvl>
+    <w:lvl w:ilvl="8" w:tplc="10090005" w:tentative="1">
+      <w:start w:val="1"/>
+      <w:numFmt w:val="bullet"/>
+      <w:lvlText w:val=""/>
+      <w:lvlJc w:val="left"/>
+      <w:pPr>
+        <w:ind w:left="6580" w:hanging="360"/>
+      </w:pPr>
+      <w:rPr>
+        <w:rFonts w:ascii="Wingdings" w:hAnsi="Wingdings" w:hint="default"/>
+      </w:rPr>
+    </w:lvl>
+  </w:abstractNum>
+  <w:abstractNum w:abstractNumId="5" w15:restartNumberingAfterBreak="0">
     <w:nsid w:val="52455BF3"/>
     <w:multiLevelType w:val="hybridMultilevel"/>
     <w:tmpl w:val="93DE3378"/>
@@ -4890,7 +5341,7 @@
       </w:rPr>
     </w:lvl>
   </w:abstractNum>
-  <w:abstractNum w:abstractNumId="4" w15:restartNumberingAfterBreak="0">
+  <w:abstractNum w:abstractNumId="6" w15:restartNumberingAfterBreak="0">
     <w:nsid w:val="5A220877"/>
     <w:multiLevelType w:val="hybridMultilevel"/>
     <w:tmpl w:val="CE9488C6"/>
@@ -5011,7 +5462,7 @@
       </w:rPr>
     </w:lvl>
   </w:abstractNum>
-  <w:abstractNum w:abstractNumId="5" w15:restartNumberingAfterBreak="0">
+  <w:abstractNum w:abstractNumId="7" w15:restartNumberingAfterBreak="0">
     <w:nsid w:val="5B3260CE"/>
     <w:multiLevelType w:val="hybridMultilevel"/>
     <w:tmpl w:val="28C2F5F0"/>
@@ -5124,7 +5575,7 @@
       </w:rPr>
     </w:lvl>
   </w:abstractNum>
-  <w:abstractNum w:abstractNumId="6" w15:restartNumberingAfterBreak="0">
+  <w:abstractNum w:abstractNumId="8" w15:restartNumberingAfterBreak="0">
     <w:nsid w:val="640D1C45"/>
     <w:multiLevelType w:val="hybridMultilevel"/>
     <w:tmpl w:val="517C668E"/>
@@ -5237,7 +5688,7 @@
       </w:rPr>
     </w:lvl>
   </w:abstractNum>
-  <w:abstractNum w:abstractNumId="7" w15:restartNumberingAfterBreak="0">
+  <w:abstractNum w:abstractNumId="9" w15:restartNumberingAfterBreak="0">
     <w:nsid w:val="72230B96"/>
     <w:multiLevelType w:val="hybridMultilevel"/>
     <w:tmpl w:val="5C245934"/>
@@ -5360,28 +5811,34 @@
     </w:lvl>
   </w:abstractNum>
   <w:num w:numId="1" w16cid:durableId="8920207">
-    <w:abstractNumId w:val="2"/>
+    <w:abstractNumId w:val="3"/>
   </w:num>
   <w:num w:numId="2" w16cid:durableId="1259294082">
     <w:abstractNumId w:val="1"/>
   </w:num>
   <w:num w:numId="3" w16cid:durableId="146407487">
-    <w:abstractNumId w:val="4"/>
+    <w:abstractNumId w:val="6"/>
   </w:num>
   <w:num w:numId="4" w16cid:durableId="1113013194">
-    <w:abstractNumId w:val="3"/>
+    <w:abstractNumId w:val="5"/>
   </w:num>
   <w:num w:numId="5" w16cid:durableId="1049842764">
     <w:abstractNumId w:val="0"/>
   </w:num>
   <w:num w:numId="6" w16cid:durableId="1667319357">
-    <w:abstractNumId w:val="5"/>
+    <w:abstractNumId w:val="7"/>
   </w:num>
   <w:num w:numId="7" w16cid:durableId="602106514">
-    <w:abstractNumId w:val="7"/>
+    <w:abstractNumId w:val="9"/>
   </w:num>
   <w:num w:numId="8" w16cid:durableId="77141165">
-    <w:abstractNumId w:val="6"/>
+    <w:abstractNumId w:val="8"/>
+  </w:num>
+  <w:num w:numId="9" w16cid:durableId="528757754">
+    <w:abstractNumId w:val="2"/>
+  </w:num>
+  <w:num w:numId="10" w16cid:durableId="2012025295">
+    <w:abstractNumId w:val="4"/>
   </w:num>
 </w:numbering>
 </file>
@@ -5790,7 +6247,6 @@
   <w:style w:type="character" w:default="1" w:styleId="DefaultParagraphFont">
     <w:name w:val="Default Paragraph Font"/>
     <w:uiPriority w:val="1"/>
-    <w:semiHidden/>
     <w:unhideWhenUsed/>
   </w:style>
   <w:style w:type="table" w:default="1" w:styleId="TableNormal">

</xml_diff>